<commit_message>
Add missing sections and premium PDF CV templates
</commit_message>
<xml_diff>
--- a/public/cv/CV_Patrick_Jovani_Data_IA.docx
+++ b/public/cv/CV_Patrick_Jovani_Data_IA.docx
@@ -49,6 +49,20 @@
         <w:pStyle w:val="Heading2"/>
       </w:pPr>
       <w:r>
+        <w:t xml:space="preserve">Compétences</w:t>
+      </w:r>
+    </w:p>
+    <w:p>
+      <w:r>
+        <w:t xml:space="preserve">Python, SQL, MySQL, PostgreSQL, Excel, Power BI, pandas, NumPy, Snowflake</w:t>
+      </w:r>
+    </w:p>
+    <w:p/>
+    <w:p>
+      <w:pPr>
+        <w:pStyle w:val="Heading2"/>
+      </w:pPr>
+      <w:r>
         <w:t xml:space="preserve">Expériences Professionnelles</w:t>
       </w:r>
     </w:p>
@@ -206,6 +220,12 @@
     </w:p>
     <w:p>
       <w:r>
+        <w:t xml:space="preserve">Spécialisation en Machine Learning, Big Data et Modélisation avancée.</w:t>
+      </w:r>
+    </w:p>
+    <w:p/>
+    <w:p>
+      <w:r>
         <w:rPr>
           <w:b/>
           <w:bCs/>
@@ -222,6 +242,12 @@
     </w:p>
     <w:p>
       <w:r>
+        <w:t xml:space="preserve">Algorithmique, Bases de données, Dev full-stack et analyse de données.</w:t>
+      </w:r>
+    </w:p>
+    <w:p/>
+    <w:p>
+      <w:r>
         <w:rPr>
           <w:b/>
           <w:bCs/>
@@ -236,6 +262,12 @@
         <w:t xml:space="preserve"> | 2023 - 2025</w:t>
       </w:r>
     </w:p>
+    <w:p>
+      <w:r>
+        <w:t xml:space="preserve">Fondations mathématiques et scientifiques poussées, algorithmique fondamentale.</w:t>
+      </w:r>
+    </w:p>
+    <w:p/>
     <w:sectPr>
       <w:pgSz w:w="11906" w:h="16838" w:orient="portrait"/>
       <w:pgMar w:top="1440" w:right="1440" w:bottom="1440" w:left="1440" w:header="708" w:footer="708" w:gutter="0"/>

</xml_diff>